<commit_message>
Posicionamiento de las 18 teteras.
</commit_message>
<xml_diff>
--- a/Materiales.docx
+++ b/Materiales.docx
@@ -8,6 +8,13 @@
       </w:r>
     </w:p>
     <w:p>
+      <w:pPr>
+        <w:pStyle w:val="Prrafodelista"/>
+        <w:numPr>
+          <w:ilvl w:val="0"/>
+          <w:numId w:val="1"/>
+        </w:numPr>
+      </w:pPr>
       <w:r>
         <w:t>Patio: Barro con textura procedural sin normal</w:t>
       </w:r>
@@ -29,6 +36,13 @@
       <w:proofErr w:type="spellEnd"/>
     </w:p>
     <w:p>
+      <w:pPr>
+        <w:pStyle w:val="Prrafodelista"/>
+        <w:numPr>
+          <w:ilvl w:val="0"/>
+          <w:numId w:val="1"/>
+        </w:numPr>
+      </w:pPr>
       <w:r>
         <w:t>Barandal del patio: Metal con textura auto_23 sin normal</w:t>
       </w:r>
@@ -50,6 +64,13 @@
       <w:proofErr w:type="spellEnd"/>
     </w:p>
     <w:p>
+      <w:pPr>
+        <w:pStyle w:val="Prrafodelista"/>
+        <w:numPr>
+          <w:ilvl w:val="0"/>
+          <w:numId w:val="1"/>
+        </w:numPr>
+      </w:pPr>
       <w:r>
         <w:t>Ventana: Metal sin textura ni normal</w:t>
       </w:r>
@@ -71,6 +92,13 @@
       <w:proofErr w:type="spellEnd"/>
     </w:p>
     <w:p>
+      <w:pPr>
+        <w:pStyle w:val="Prrafodelista"/>
+        <w:numPr>
+          <w:ilvl w:val="0"/>
+          <w:numId w:val="1"/>
+        </w:numPr>
+      </w:pPr>
       <w:r>
         <w:t>Paredes: Barro sin textura ni normal</w:t>
       </w:r>
@@ -92,6 +120,13 @@
       <w:proofErr w:type="spellEnd"/>
     </w:p>
     <w:p>
+      <w:pPr>
+        <w:pStyle w:val="Prrafodelista"/>
+        <w:numPr>
+          <w:ilvl w:val="0"/>
+          <w:numId w:val="1"/>
+        </w:numPr>
+      </w:pPr>
       <w:r>
         <w:t>Piso interno:</w:t>
       </w:r>
@@ -122,45 +157,199 @@
       <w:proofErr w:type="spellEnd"/>
     </w:p>
     <w:p>
+      <w:pPr>
+        <w:pStyle w:val="Prrafodelista"/>
+        <w:numPr>
+          <w:ilvl w:val="0"/>
+          <w:numId w:val="1"/>
+        </w:numPr>
+      </w:pPr>
       <w:r>
         <w:t>Alfombra: Barro con la te</w:t>
       </w:r>
       <w:r>
         <w:t>x</w:t>
+      </w:r>
+      <w:r>
+        <w:t xml:space="preserve">tura </w:t>
+      </w:r>
+      <w:proofErr w:type="spellStart"/>
+      <w:r>
+        <w:t>skettle</w:t>
+      </w:r>
+      <w:proofErr w:type="spellEnd"/>
+      <w:r>
+        <w:t xml:space="preserve"> con normal, </w:t>
+      </w:r>
+      <w:proofErr w:type="spellStart"/>
+      <w:r>
+        <w:t>shader</w:t>
+      </w:r>
+      <w:proofErr w:type="spellEnd"/>
+      <w:r>
+        <w:t xml:space="preserve"> </w:t>
+      </w:r>
+      <w:proofErr w:type="spellStart"/>
+      <w:r>
+        <w:t>CookTorrance</w:t>
+      </w:r>
+      <w:proofErr w:type="spellEnd"/>
+    </w:p>
+    <w:p>
+      <w:pPr>
+        <w:pStyle w:val="Prrafodelista"/>
+        <w:numPr>
+          <w:ilvl w:val="0"/>
+          <w:numId w:val="1"/>
+        </w:numPr>
+      </w:pPr>
+      <w:r>
+        <w:t>V</w:t>
+      </w:r>
+      <w:r>
+        <w:t xml:space="preserve">idrio de ventana: Vidrio sin textura ni normal </w:t>
+      </w:r>
+      <w:proofErr w:type="spellStart"/>
+      <w:r>
+        <w:t>shader</w:t>
+      </w:r>
+      <w:proofErr w:type="spellEnd"/>
+      <w:r>
+        <w:t xml:space="preserve"> </w:t>
+      </w:r>
+      <w:proofErr w:type="spellStart"/>
+      <w:r>
+        <w:t>Blinn</w:t>
+      </w:r>
+      <w:proofErr w:type="spellEnd"/>
+    </w:p>
+    <w:p>
+      <w:pPr>
+        <w:pStyle w:val="Prrafodelista"/>
+        <w:numPr>
+          <w:ilvl w:val="0"/>
+          <w:numId w:val="1"/>
+        </w:numPr>
+      </w:pPr>
+      <w:r>
+        <w:t xml:space="preserve">Vidrio de barra exterior: Vidrio con textura _auto_40 sin normal </w:t>
+      </w:r>
+      <w:proofErr w:type="spellStart"/>
+      <w:r>
+        <w:t>shader</w:t>
+      </w:r>
+      <w:proofErr w:type="spellEnd"/>
+      <w:r>
+        <w:t xml:space="preserve"> </w:t>
+      </w:r>
+      <w:proofErr w:type="spellStart"/>
+      <w:r>
+        <w:t>Toon</w:t>
+      </w:r>
+      <w:proofErr w:type="spellEnd"/>
+    </w:p>
+    <w:p>
+      <w:pPr>
+        <w:pStyle w:val="Prrafodelista"/>
+        <w:numPr>
+          <w:ilvl w:val="0"/>
+          <w:numId w:val="1"/>
+        </w:numPr>
+      </w:pPr>
+      <w:r>
+        <w:t>Sillas: Metal con textura</w:t>
+      </w:r>
+      <w:r>
+        <w:t xml:space="preserve"> _auto_ con normal </w:t>
+      </w:r>
+      <w:proofErr w:type="spellStart"/>
+      <w:r>
+        <w:t>shader</w:t>
+      </w:r>
+      <w:proofErr w:type="spellEnd"/>
+      <w:r>
+        <w:t xml:space="preserve"> </w:t>
+      </w:r>
+      <w:proofErr w:type="spellStart"/>
+      <w:r>
+        <w:t>Blinn</w:t>
+      </w:r>
+      <w:proofErr w:type="spellEnd"/>
+    </w:p>
+    <w:p>
+      <w:pPr>
+        <w:pStyle w:val="Prrafodelista"/>
+        <w:numPr>
+          <w:ilvl w:val="0"/>
+          <w:numId w:val="1"/>
+        </w:numPr>
+      </w:pPr>
+      <w:r>
+        <w:t>Patas silla: Metal con textura Default-</w:t>
+      </w:r>
+      <w:proofErr w:type="spellStart"/>
+      <w:r>
+        <w:t>Particle</w:t>
+      </w:r>
+      <w:proofErr w:type="spellEnd"/>
+      <w:r>
+        <w:t xml:space="preserve"> sin normal </w:t>
+      </w:r>
+      <w:proofErr w:type="spellStart"/>
+      <w:r>
+        <w:t>shader</w:t>
+      </w:r>
+      <w:proofErr w:type="spellEnd"/>
+      <w:r>
+        <w:t xml:space="preserve"> </w:t>
+      </w:r>
+      <w:proofErr w:type="spellStart"/>
+      <w:r>
+        <w:t>Toon</w:t>
+      </w:r>
+      <w:proofErr w:type="spellEnd"/>
+    </w:p>
+    <w:p>
+      <w:pPr>
+        <w:pStyle w:val="Prrafodelista"/>
+        <w:numPr>
+          <w:ilvl w:val="0"/>
+          <w:numId w:val="1"/>
+        </w:numPr>
+      </w:pPr>
+      <w:r>
+        <w:t xml:space="preserve">Parte exterior de la mesa: Vidrio con textura _auto_51 sin </w:t>
+      </w:r>
+      <w:r>
+        <w:t>normal</w:t>
       </w:r>
       <w:bookmarkStart w:id="0" w:name="_GoBack"/>
       <w:bookmarkEnd w:id="0"/>
       <w:r>
-        <w:t xml:space="preserve">tura </w:t>
-      </w:r>
-      <w:proofErr w:type="spellStart"/>
-      <w:r>
-        <w:t>skettle</w:t>
-      </w:r>
-      <w:proofErr w:type="spellEnd"/>
-      <w:r>
-        <w:t xml:space="preserve"> con normal, </w:t>
-      </w:r>
-      <w:proofErr w:type="spellStart"/>
-      <w:r>
-        <w:t>shader</w:t>
-      </w:r>
-      <w:proofErr w:type="spellEnd"/>
-      <w:r>
-        <w:t xml:space="preserve"> </w:t>
-      </w:r>
-      <w:proofErr w:type="spellStart"/>
-      <w:r>
-        <w:t>CookTorrance</w:t>
-      </w:r>
-      <w:proofErr w:type="spellEnd"/>
-    </w:p>
-    <w:p>
-      <w:r>
-        <w:t>V</w:t>
-      </w:r>
-      <w:r>
-        <w:t xml:space="preserve">idrio de ventana: Vidrio sin textura ni normal </w:t>
+        <w:t xml:space="preserve"> </w:t>
+      </w:r>
+      <w:proofErr w:type="spellStart"/>
+      <w:r>
+        <w:t>shader</w:t>
+      </w:r>
+      <w:proofErr w:type="spellEnd"/>
+      <w:r>
+        <w:t xml:space="preserve"> Cook Torrance</w:t>
+      </w:r>
+    </w:p>
+    <w:p>
+      <w:pPr>
+        <w:pStyle w:val="Prrafodelista"/>
+        <w:numPr>
+          <w:ilvl w:val="0"/>
+          <w:numId w:val="1"/>
+        </w:numPr>
+      </w:pPr>
+      <w:r>
+        <w:t xml:space="preserve">Patas de </w:t>
+      </w:r>
+      <w:r>
+        <w:t xml:space="preserve">Mesa: Metal con textura procedural con normal con </w:t>
       </w:r>
       <w:proofErr w:type="spellStart"/>
       <w:r>
@@ -177,8 +366,15 @@
       <w:proofErr w:type="spellEnd"/>
     </w:p>
     <w:p>
-      <w:r>
-        <w:t xml:space="preserve">Vidrio de barra exterior: Vidrio con textura _auto_40 sin normal </w:t>
+      <w:pPr>
+        <w:pStyle w:val="Prrafodelista"/>
+        <w:numPr>
+          <w:ilvl w:val="0"/>
+          <w:numId w:val="1"/>
+        </w:numPr>
+      </w:pPr>
+      <w:r>
+        <w:t xml:space="preserve">Parte interior de la mesa: Vidrio con textura procedural con normal con </w:t>
       </w:r>
       <w:proofErr w:type="spellStart"/>
       <w:r>
@@ -195,11 +391,71 @@
       <w:proofErr w:type="spellEnd"/>
     </w:p>
     <w:p>
-      <w:r>
-        <w:t>Sillas: Metal con textura</w:t>
-      </w:r>
-      <w:r>
-        <w:t xml:space="preserve"> _auto_ con normal </w:t>
+      <w:pPr>
+        <w:pStyle w:val="Prrafodelista"/>
+        <w:numPr>
+          <w:ilvl w:val="0"/>
+          <w:numId w:val="1"/>
+        </w:numPr>
+      </w:pPr>
+      <w:proofErr w:type="spellStart"/>
+      <w:r>
+        <w:t>Bidon</w:t>
+      </w:r>
+      <w:proofErr w:type="spellEnd"/>
+      <w:r>
+        <w:t xml:space="preserve"> de agua: Vidrio con textura _auto_40 con normal </w:t>
+      </w:r>
+      <w:proofErr w:type="spellStart"/>
+      <w:r>
+        <w:t>shader</w:t>
+      </w:r>
+      <w:proofErr w:type="spellEnd"/>
+      <w:r>
+        <w:t xml:space="preserve"> Cook Torrance</w:t>
+      </w:r>
+    </w:p>
+    <w:p>
+      <w:pPr>
+        <w:pStyle w:val="Prrafodelista"/>
+        <w:numPr>
+          <w:ilvl w:val="0"/>
+          <w:numId w:val="1"/>
+        </w:numPr>
+      </w:pPr>
+      <w:r>
+        <w:t>Base del bidón: Barro</w:t>
+      </w:r>
+      <w:r>
+        <w:t xml:space="preserve"> con textura _auto_22 con normal </w:t>
+      </w:r>
+      <w:proofErr w:type="spellStart"/>
+      <w:r>
+        <w:t>shader</w:t>
+      </w:r>
+      <w:proofErr w:type="spellEnd"/>
+      <w:r>
+        <w:t xml:space="preserve"> </w:t>
+      </w:r>
+      <w:proofErr w:type="spellStart"/>
+      <w:r>
+        <w:t>CookTorance</w:t>
+      </w:r>
+      <w:proofErr w:type="spellEnd"/>
+    </w:p>
+    <w:p>
+      <w:pPr>
+        <w:pStyle w:val="Prrafodelista"/>
+        <w:numPr>
+          <w:ilvl w:val="0"/>
+          <w:numId w:val="1"/>
+        </w:numPr>
+      </w:pPr>
+      <w:r>
+        <w:t>Desayunador: Barro con textura piso de madera con normal</w:t>
+      </w:r>
+      <w:r>
+        <w:t xml:space="preserve"> </w:t>
       </w:r>
       <w:proofErr w:type="spellStart"/>
       <w:r>
@@ -216,50 +472,40 @@
       <w:proofErr w:type="spellEnd"/>
     </w:p>
     <w:p>
-      <w:r>
-        <w:t>Patas silla: Metal con textura Default-</w:t>
-      </w:r>
-      <w:proofErr w:type="spellStart"/>
-      <w:r>
-        <w:t>Particle</w:t>
-      </w:r>
-      <w:proofErr w:type="spellEnd"/>
-      <w:r>
-        <w:t xml:space="preserve"> sin normal </w:t>
-      </w:r>
-      <w:proofErr w:type="spellStart"/>
-      <w:r>
-        <w:t>shader</w:t>
-      </w:r>
-      <w:proofErr w:type="spellEnd"/>
-      <w:r>
-        <w:t xml:space="preserve"> </w:t>
-      </w:r>
-      <w:proofErr w:type="spellStart"/>
-      <w:r>
-        <w:t>Toon</w:t>
-      </w:r>
-      <w:proofErr w:type="spellEnd"/>
-    </w:p>
-    <w:p>
-      <w:r>
-        <w:t xml:space="preserve">Parte exterior de la mesa: Vidrio con textura _auto_51 sin textura </w:t>
-      </w:r>
-      <w:proofErr w:type="spellStart"/>
-      <w:r>
-        <w:t>shader</w:t>
-      </w:r>
-      <w:proofErr w:type="spellEnd"/>
-      <w:r>
-        <w:t xml:space="preserve"> Cook Torrance</w:t>
-      </w:r>
-    </w:p>
-    <w:p>
-      <w:r>
-        <w:t xml:space="preserve">Patas de </w:t>
-      </w:r>
-      <w:r>
-        <w:t xml:space="preserve">Mesa: Metal con textura procedural con normal con </w:t>
+      <w:pPr>
+        <w:pStyle w:val="Prrafodelista"/>
+        <w:numPr>
+          <w:ilvl w:val="0"/>
+          <w:numId w:val="1"/>
+        </w:numPr>
+      </w:pPr>
+      <w:r>
+        <w:t xml:space="preserve">Cafetera: Metal con textura _auto_4 con normal </w:t>
+      </w:r>
+      <w:proofErr w:type="spellStart"/>
+      <w:r>
+        <w:t>shader</w:t>
+      </w:r>
+      <w:proofErr w:type="spellEnd"/>
+      <w:r>
+        <w:t xml:space="preserve"> </w:t>
+      </w:r>
+      <w:proofErr w:type="spellStart"/>
+      <w:r>
+        <w:t>Toon.</w:t>
+      </w:r>
+      <w:proofErr w:type="spellEnd"/>
+    </w:p>
+    <w:p>
+      <w:pPr>
+        <w:pStyle w:val="Prrafodelista"/>
+        <w:numPr>
+          <w:ilvl w:val="0"/>
+          <w:numId w:val="1"/>
+        </w:numPr>
+      </w:pPr>
+      <w:r>
+        <w:t xml:space="preserve">Llave de luz: Barro con textura _auto_6 sin normal </w:t>
       </w:r>
       <w:proofErr w:type="spellStart"/>
       <w:r>
@@ -276,91 +522,13 @@
       <w:proofErr w:type="spellEnd"/>
     </w:p>
     <w:p>
-      <w:r>
-        <w:t xml:space="preserve">Parte interior de la mesa: Vidrio con textura procedural con normal con </w:t>
-      </w:r>
-      <w:proofErr w:type="spellStart"/>
-      <w:r>
-        <w:t>shader</w:t>
-      </w:r>
-      <w:proofErr w:type="spellEnd"/>
-      <w:r>
-        <w:t xml:space="preserve"> </w:t>
-      </w:r>
-      <w:proofErr w:type="spellStart"/>
-      <w:r>
-        <w:t>Toon</w:t>
-      </w:r>
-      <w:proofErr w:type="spellEnd"/>
-    </w:p>
-    <w:p>
-      <w:proofErr w:type="spellStart"/>
-      <w:r>
-        <w:t>Bidon</w:t>
-      </w:r>
-      <w:proofErr w:type="spellEnd"/>
-      <w:r>
-        <w:t xml:space="preserve"> de agua: Vidrio con textura _auto_40 con normal </w:t>
-      </w:r>
-      <w:proofErr w:type="spellStart"/>
-      <w:r>
-        <w:t>shader</w:t>
-      </w:r>
-      <w:proofErr w:type="spellEnd"/>
-      <w:r>
-        <w:t xml:space="preserve"> Cook Torrance</w:t>
-      </w:r>
-    </w:p>
-    <w:p>
-      <w:r>
-        <w:t>Base del bidón: Barro con textura _ato_22 con normal.</w:t>
-      </w:r>
-    </w:p>
-    <w:p>
-      <w:r>
-        <w:t>Desayunador: Barro con textura piso de madera con normal</w:t>
-      </w:r>
-    </w:p>
-    <w:p>
-      <w:r>
-        <w:t xml:space="preserve">Cafetera: Metal con textura _auto_4 con normal </w:t>
-      </w:r>
-      <w:proofErr w:type="spellStart"/>
-      <w:r>
-        <w:t>shader</w:t>
-      </w:r>
-      <w:proofErr w:type="spellEnd"/>
-      <w:r>
-        <w:t xml:space="preserve"> </w:t>
-      </w:r>
-      <w:proofErr w:type="spellStart"/>
-      <w:r>
-        <w:t>Toon</w:t>
-      </w:r>
-      <w:proofErr w:type="spellEnd"/>
-      <w:r>
-        <w:t>.</w:t>
-      </w:r>
-    </w:p>
-    <w:p>
-      <w:r>
-        <w:t xml:space="preserve">Llave de luz: Barro con textura _auto_6 sin normal </w:t>
-      </w:r>
-      <w:proofErr w:type="spellStart"/>
-      <w:r>
-        <w:t>shader</w:t>
-      </w:r>
-      <w:proofErr w:type="spellEnd"/>
-      <w:r>
-        <w:t xml:space="preserve"> </w:t>
-      </w:r>
-      <w:proofErr w:type="spellStart"/>
-      <w:r>
-        <w:t>Blinn</w:t>
-      </w:r>
-      <w:proofErr w:type="spellEnd"/>
-    </w:p>
-    <w:p>
+      <w:pPr>
+        <w:pStyle w:val="Prrafodelista"/>
+        <w:numPr>
+          <w:ilvl w:val="0"/>
+          <w:numId w:val="1"/>
+        </w:numPr>
+      </w:pPr>
       <w:r>
         <w:t xml:space="preserve">Mesada y sobre mesada: Barro con textura de piso de madera sin normal </w:t>
       </w:r>
@@ -389,6 +557,103 @@
     </w:sectPr>
   </w:body>
 </w:document>
+</file>
+
+<file path=word/numbering.xml><?xml version="1.0" encoding="utf-8"?>
+<w:numbering xmlns:wpc="http://schemas.microsoft.com/office/word/2010/wordprocessingCanvas" xmlns:cx="http://schemas.microsoft.com/office/drawing/2014/chartex" xmlns:mc="http://schemas.openxmlformats.org/markup-compatibility/2006" xmlns:o="urn:schemas-microsoft-com:office:office" xmlns:r="http://schemas.openxmlformats.org/officeDocument/2006/relationships" xmlns:m="http://schemas.openxmlformats.org/officeDocument/2006/math" xmlns:v="urn:schemas-microsoft-com:vml" xmlns:wp14="http://schemas.microsoft.com/office/word/2010/wordprocessingDrawing" xmlns:wp="http://schemas.openxmlformats.org/drawingml/2006/wordprocessingDrawing" xmlns:w10="urn:schemas-microsoft-com:office:word" xmlns:w="http://schemas.openxmlformats.org/wordprocessingml/2006/main" xmlns:w14="http://schemas.microsoft.com/office/word/2010/wordml" xmlns:w15="http://schemas.microsoft.com/office/word/2012/wordml" xmlns:w16se="http://schemas.microsoft.com/office/word/2015/wordml/symex" xmlns:wpg="http://schemas.microsoft.com/office/word/2010/wordprocessingGroup" xmlns:wpi="http://schemas.microsoft.com/office/word/2010/wordprocessingInk" xmlns:wne="http://schemas.microsoft.com/office/word/2006/wordml" xmlns:wps="http://schemas.microsoft.com/office/word/2010/wordprocessingShape" mc:Ignorable="w14 w15 w16se wp14">
+  <w:abstractNum w:abstractNumId="0" w15:restartNumberingAfterBreak="0">
+    <w:nsid w:val="55445C53"/>
+    <w:multiLevelType w:val="hybridMultilevel"/>
+    <w:tmpl w:val="6EE81FCE"/>
+    <w:lvl w:ilvl="0" w:tplc="F36C1B6C">
+      <w:start w:val="1"/>
+      <w:numFmt w:val="decimal"/>
+      <w:lvlText w:val="%1-"/>
+      <w:lvlJc w:val="left"/>
+      <w:pPr>
+        <w:ind w:left="720" w:hanging="360"/>
+      </w:pPr>
+      <w:rPr>
+        <w:rFonts w:hint="default"/>
+      </w:rPr>
+    </w:lvl>
+    <w:lvl w:ilvl="1" w:tplc="2C0A0019" w:tentative="1">
+      <w:start w:val="1"/>
+      <w:numFmt w:val="lowerLetter"/>
+      <w:lvlText w:val="%2."/>
+      <w:lvlJc w:val="left"/>
+      <w:pPr>
+        <w:ind w:left="1440" w:hanging="360"/>
+      </w:pPr>
+    </w:lvl>
+    <w:lvl w:ilvl="2" w:tplc="2C0A001B" w:tentative="1">
+      <w:start w:val="1"/>
+      <w:numFmt w:val="lowerRoman"/>
+      <w:lvlText w:val="%3."/>
+      <w:lvlJc w:val="right"/>
+      <w:pPr>
+        <w:ind w:left="2160" w:hanging="180"/>
+      </w:pPr>
+    </w:lvl>
+    <w:lvl w:ilvl="3" w:tplc="2C0A000F" w:tentative="1">
+      <w:start w:val="1"/>
+      <w:numFmt w:val="decimal"/>
+      <w:lvlText w:val="%4."/>
+      <w:lvlJc w:val="left"/>
+      <w:pPr>
+        <w:ind w:left="2880" w:hanging="360"/>
+      </w:pPr>
+    </w:lvl>
+    <w:lvl w:ilvl="4" w:tplc="2C0A0019" w:tentative="1">
+      <w:start w:val="1"/>
+      <w:numFmt w:val="lowerLetter"/>
+      <w:lvlText w:val="%5."/>
+      <w:lvlJc w:val="left"/>
+      <w:pPr>
+        <w:ind w:left="3600" w:hanging="360"/>
+      </w:pPr>
+    </w:lvl>
+    <w:lvl w:ilvl="5" w:tplc="2C0A001B" w:tentative="1">
+      <w:start w:val="1"/>
+      <w:numFmt w:val="lowerRoman"/>
+      <w:lvlText w:val="%6."/>
+      <w:lvlJc w:val="right"/>
+      <w:pPr>
+        <w:ind w:left="4320" w:hanging="180"/>
+      </w:pPr>
+    </w:lvl>
+    <w:lvl w:ilvl="6" w:tplc="2C0A000F" w:tentative="1">
+      <w:start w:val="1"/>
+      <w:numFmt w:val="decimal"/>
+      <w:lvlText w:val="%7."/>
+      <w:lvlJc w:val="left"/>
+      <w:pPr>
+        <w:ind w:left="5040" w:hanging="360"/>
+      </w:pPr>
+    </w:lvl>
+    <w:lvl w:ilvl="7" w:tplc="2C0A0019" w:tentative="1">
+      <w:start w:val="1"/>
+      <w:numFmt w:val="lowerLetter"/>
+      <w:lvlText w:val="%8."/>
+      <w:lvlJc w:val="left"/>
+      <w:pPr>
+        <w:ind w:left="5760" w:hanging="360"/>
+      </w:pPr>
+    </w:lvl>
+    <w:lvl w:ilvl="8" w:tplc="2C0A001B" w:tentative="1">
+      <w:start w:val="1"/>
+      <w:numFmt w:val="lowerRoman"/>
+      <w:lvlText w:val="%9."/>
+      <w:lvlJc w:val="right"/>
+      <w:pPr>
+        <w:ind w:left="6480" w:hanging="180"/>
+      </w:pPr>
+    </w:lvl>
+  </w:abstractNum>
+  <w:num w:numId="1">
+    <w:abstractNumId w:val="0"/>
+  </w:num>
+</w:numbering>
 </file>
 
 <file path=word/styles.xml><?xml version="1.0" encoding="utf-8"?>
@@ -812,6 +1077,17 @@
     <w:semiHidden/>
     <w:unhideWhenUsed/>
   </w:style>
+  <w:style w:type="paragraph" w:styleId="Prrafodelista">
+    <w:name w:val="List Paragraph"/>
+    <w:basedOn w:val="Normal"/>
+    <w:uiPriority w:val="34"/>
+    <w:qFormat/>
+    <w:rsid w:val="00F2712A"/>
+    <w:pPr>
+      <w:ind w:left="720"/>
+      <w:contextualSpacing/>
+    </w:pPr>
+  </w:style>
 </w:styles>
 </file>
 

</xml_diff>

<commit_message>
Puesta de nombres significativos a los objetos
</commit_message>
<xml_diff>
--- a/Materiales.docx
+++ b/Materiales.docx
@@ -137,55 +137,14 @@
         <w:t xml:space="preserve"> Textura proc</w:t>
       </w:r>
       <w:r>
-        <w:t>edural sin normales,</w:t>
-      </w:r>
-      <w:r>
-        <w:t xml:space="preserve"> </w:t>
-      </w:r>
-      <w:proofErr w:type="spellStart"/>
-      <w:r>
-        <w:t>shader</w:t>
-      </w:r>
-      <w:proofErr w:type="spellEnd"/>
-      <w:r>
-        <w:t xml:space="preserve"> </w:t>
-      </w:r>
-      <w:proofErr w:type="spellStart"/>
-      <w:r>
-        <w:t>Blinn</w:t>
-      </w:r>
-      <w:proofErr w:type="spellEnd"/>
-    </w:p>
-    <w:p>
-      <w:pPr>
-        <w:pStyle w:val="Prrafodelista"/>
-        <w:numPr>
-          <w:ilvl w:val="0"/>
-          <w:numId w:val="1"/>
-        </w:numPr>
-      </w:pPr>
-      <w:r>
-        <w:t>Alfombra: Barro con la te</w:t>
-      </w:r>
-      <w:r>
-        <w:t>x</w:t>
-      </w:r>
-      <w:r>
-        <w:t xml:space="preserve">tura </w:t>
-      </w:r>
-      <w:proofErr w:type="spellStart"/>
-      <w:r>
-        <w:t>skettle</w:t>
-      </w:r>
-      <w:proofErr w:type="spellEnd"/>
-      <w:r>
-        <w:t xml:space="preserve"> con normal, </w:t>
-      </w:r>
-      <w:proofErr w:type="spellStart"/>
-      <w:r>
-        <w:t>shader</w:t>
-      </w:r>
-      <w:proofErr w:type="spellEnd"/>
+        <w:t xml:space="preserve">edural </w:t>
+      </w:r>
+      <w:r>
+        <w:t>con</w:t>
+      </w:r>
+      <w:r>
+        <w:t xml:space="preserve"> normales,</w:t>
+      </w:r>
       <w:r>
         <w:t xml:space="preserve"> </w:t>
       </w:r>
@@ -203,129 +162,168 @@
           <w:numId w:val="1"/>
         </w:numPr>
       </w:pPr>
-      <w:r>
-        <w:t>V</w:t>
-      </w:r>
-      <w:r>
-        <w:t xml:space="preserve">idrio de ventana: Vidrio sin textura ni normal </w:t>
-      </w:r>
-      <w:proofErr w:type="spellStart"/>
-      <w:r>
-        <w:t>shader</w:t>
-      </w:r>
-      <w:proofErr w:type="spellEnd"/>
-      <w:r>
-        <w:t xml:space="preserve"> </w:t>
-      </w:r>
-      <w:proofErr w:type="spellStart"/>
-      <w:r>
-        <w:t>Blinn</w:t>
-      </w:r>
-      <w:proofErr w:type="spellEnd"/>
-    </w:p>
-    <w:p>
-      <w:pPr>
-        <w:pStyle w:val="Prrafodelista"/>
-        <w:numPr>
-          <w:ilvl w:val="0"/>
-          <w:numId w:val="1"/>
-        </w:numPr>
-      </w:pPr>
-      <w:r>
-        <w:t xml:space="preserve">Vidrio de barra exterior: Vidrio con textura _auto_40 sin normal </w:t>
-      </w:r>
-      <w:proofErr w:type="spellStart"/>
-      <w:r>
-        <w:t>shader</w:t>
-      </w:r>
-      <w:proofErr w:type="spellEnd"/>
-      <w:r>
-        <w:t xml:space="preserve"> </w:t>
-      </w:r>
-      <w:proofErr w:type="spellStart"/>
-      <w:r>
-        <w:t>Toon</w:t>
-      </w:r>
-      <w:proofErr w:type="spellEnd"/>
-    </w:p>
-    <w:p>
-      <w:pPr>
-        <w:pStyle w:val="Prrafodelista"/>
-        <w:numPr>
-          <w:ilvl w:val="0"/>
-          <w:numId w:val="1"/>
-        </w:numPr>
-      </w:pPr>
-      <w:r>
-        <w:t>Sillas: Metal con textura</w:t>
-      </w:r>
-      <w:r>
-        <w:t xml:space="preserve"> _auto_ con normal </w:t>
-      </w:r>
-      <w:proofErr w:type="spellStart"/>
-      <w:r>
-        <w:t>shader</w:t>
-      </w:r>
-      <w:proofErr w:type="spellEnd"/>
-      <w:r>
-        <w:t xml:space="preserve"> </w:t>
-      </w:r>
-      <w:proofErr w:type="spellStart"/>
-      <w:r>
-        <w:t>Blinn</w:t>
-      </w:r>
-      <w:proofErr w:type="spellEnd"/>
-    </w:p>
-    <w:p>
-      <w:pPr>
-        <w:pStyle w:val="Prrafodelista"/>
-        <w:numPr>
-          <w:ilvl w:val="0"/>
-          <w:numId w:val="1"/>
-        </w:numPr>
-      </w:pPr>
-      <w:r>
-        <w:t>Patas silla: Metal con textura Default-</w:t>
-      </w:r>
-      <w:proofErr w:type="spellStart"/>
-      <w:r>
-        <w:t>Particle</w:t>
-      </w:r>
-      <w:proofErr w:type="spellEnd"/>
-      <w:r>
-        <w:t xml:space="preserve"> sin normal </w:t>
-      </w:r>
-      <w:proofErr w:type="spellStart"/>
-      <w:r>
-        <w:t>shader</w:t>
-      </w:r>
-      <w:proofErr w:type="spellEnd"/>
-      <w:r>
-        <w:t xml:space="preserve"> </w:t>
-      </w:r>
-      <w:proofErr w:type="spellStart"/>
-      <w:r>
-        <w:t>Toon</w:t>
-      </w:r>
-      <w:proofErr w:type="spellEnd"/>
-    </w:p>
-    <w:p>
-      <w:pPr>
-        <w:pStyle w:val="Prrafodelista"/>
-        <w:numPr>
-          <w:ilvl w:val="0"/>
-          <w:numId w:val="1"/>
-        </w:numPr>
-      </w:pPr>
-      <w:r>
-        <w:t xml:space="preserve">Parte exterior de la mesa: Vidrio con textura _auto_51 sin </w:t>
-      </w:r>
-      <w:r>
-        <w:t>normal</w:t>
-      </w:r>
       <w:bookmarkStart w:id="0" w:name="_GoBack"/>
       <w:bookmarkEnd w:id="0"/>
       <w:r>
+        <w:t>Alfombra: Barro con la te</w:t>
+      </w:r>
+      <w:r>
+        <w:t>x</w:t>
+      </w:r>
+      <w:r>
+        <w:t xml:space="preserve">tura </w:t>
+      </w:r>
+      <w:proofErr w:type="spellStart"/>
+      <w:r>
+        <w:t>skettle</w:t>
+      </w:r>
+      <w:proofErr w:type="spellEnd"/>
+      <w:r>
+        <w:t xml:space="preserve"> con normal, </w:t>
+      </w:r>
+      <w:proofErr w:type="spellStart"/>
+      <w:r>
+        <w:t>shader</w:t>
+      </w:r>
+      <w:proofErr w:type="spellEnd"/>
+      <w:r>
+        <w:t xml:space="preserve"> </w:t>
+      </w:r>
+      <w:proofErr w:type="spellStart"/>
+      <w:r>
+        <w:t>CookTorrance</w:t>
+      </w:r>
+      <w:proofErr w:type="spellEnd"/>
+    </w:p>
+    <w:p>
+      <w:pPr>
+        <w:pStyle w:val="Prrafodelista"/>
+        <w:numPr>
+          <w:ilvl w:val="0"/>
+          <w:numId w:val="1"/>
+        </w:numPr>
+      </w:pPr>
+      <w:r>
+        <w:t>V</w:t>
+      </w:r>
+      <w:r>
+        <w:t xml:space="preserve">idrio de ventana: Vidrio sin textura ni normal </w:t>
+      </w:r>
+      <w:proofErr w:type="spellStart"/>
+      <w:r>
+        <w:t>shader</w:t>
+      </w:r>
+      <w:proofErr w:type="spellEnd"/>
+      <w:r>
+        <w:t xml:space="preserve"> </w:t>
+      </w:r>
+      <w:proofErr w:type="spellStart"/>
+      <w:r>
+        <w:t>Blinn</w:t>
+      </w:r>
+      <w:proofErr w:type="spellEnd"/>
+    </w:p>
+    <w:p>
+      <w:pPr>
+        <w:pStyle w:val="Prrafodelista"/>
+        <w:numPr>
+          <w:ilvl w:val="0"/>
+          <w:numId w:val="1"/>
+        </w:numPr>
+      </w:pPr>
+      <w:r>
+        <w:t xml:space="preserve">Vidrio de barra exterior: Vidrio con textura _auto_40 sin normal </w:t>
+      </w:r>
+      <w:proofErr w:type="spellStart"/>
+      <w:r>
+        <w:t>shader</w:t>
+      </w:r>
+      <w:proofErr w:type="spellEnd"/>
+      <w:r>
+        <w:t xml:space="preserve"> </w:t>
+      </w:r>
+      <w:proofErr w:type="spellStart"/>
+      <w:r>
+        <w:t>Toon</w:t>
+      </w:r>
+      <w:proofErr w:type="spellEnd"/>
+    </w:p>
+    <w:p>
+      <w:pPr>
+        <w:pStyle w:val="Prrafodelista"/>
+        <w:numPr>
+          <w:ilvl w:val="0"/>
+          <w:numId w:val="1"/>
+        </w:numPr>
+      </w:pPr>
+      <w:r>
+        <w:t>Sillas: Metal con textura</w:t>
+      </w:r>
+      <w:r>
+        <w:t xml:space="preserve"> _auto_ con normal </w:t>
+      </w:r>
+      <w:proofErr w:type="spellStart"/>
+      <w:r>
+        <w:t>shader</w:t>
+      </w:r>
+      <w:proofErr w:type="spellEnd"/>
+      <w:r>
+        <w:t xml:space="preserve"> </w:t>
+      </w:r>
+      <w:proofErr w:type="spellStart"/>
+      <w:r>
+        <w:t>Blinn</w:t>
+      </w:r>
+      <w:proofErr w:type="spellEnd"/>
+    </w:p>
+    <w:p>
+      <w:pPr>
+        <w:pStyle w:val="Prrafodelista"/>
+        <w:numPr>
+          <w:ilvl w:val="0"/>
+          <w:numId w:val="1"/>
+        </w:numPr>
+      </w:pPr>
+      <w:r>
+        <w:t>Patas silla: Metal con textura Default-</w:t>
+      </w:r>
+      <w:proofErr w:type="spellStart"/>
+      <w:r>
+        <w:t>Particle</w:t>
+      </w:r>
+      <w:proofErr w:type="spellEnd"/>
+      <w:r>
+        <w:t xml:space="preserve"> sin normal </w:t>
+      </w:r>
+      <w:proofErr w:type="spellStart"/>
+      <w:r>
+        <w:t>shader</w:t>
+      </w:r>
+      <w:proofErr w:type="spellEnd"/>
+      <w:r>
+        <w:t xml:space="preserve"> </w:t>
+      </w:r>
+      <w:proofErr w:type="spellStart"/>
+      <w:r>
+        <w:t>Toon</w:t>
+      </w:r>
+      <w:proofErr w:type="spellEnd"/>
+    </w:p>
+    <w:p>
+      <w:pPr>
+        <w:pStyle w:val="Prrafodelista"/>
+        <w:numPr>
+          <w:ilvl w:val="0"/>
+          <w:numId w:val="1"/>
+        </w:numPr>
+      </w:pPr>
+      <w:r>
+        <w:t xml:space="preserve">Parte exterior de la mesa: Vidrio con textura _auto_51 sin </w:t>
+      </w:r>
+      <w:r>
+        <w:t>normal</w:t>
+      </w:r>
+      <w:r>
         <w:t xml:space="preserve"> </w:t>
       </w:r>
       <w:proofErr w:type="spellStart"/>
@@ -492,9 +490,12 @@
       </w:r>
       <w:proofErr w:type="spellStart"/>
       <w:r>
-        <w:t>Toon.</w:t>
-      </w:r>
-      <w:proofErr w:type="spellEnd"/>
+        <w:t>Toon</w:t>
+      </w:r>
+      <w:proofErr w:type="spellEnd"/>
+      <w:r>
+        <w:t>.</w:t>
+      </w:r>
     </w:p>
     <w:p>
       <w:pPr>

</xml_diff>